<commit_message>
Api End point tested..........
</commit_message>
<xml_diff>
--- a/Etc_Helper/Road_Map.docx
+++ b/Etc_Helper/Road_Map.docx
@@ -2530,27 +2530,7 @@
                 <w:lang w:eastAsia="en-IN"/>
                 <w14:ligatures w14:val="none"/>
               </w:rPr>
-              <w:t xml:space="preserve">• </w:t>
-            </w:r>
-            <w:proofErr w:type="spellStart"/>
-            <w:r>
-              <w:rPr>
-                <w:rFonts w:ascii="Times New Roman" w:eastAsia="Times New Roman" w:hAnsi="Times New Roman" w:cs="Times New Roman"/>
-                <w:kern w:val="0"/>
-                <w:lang w:eastAsia="en-IN"/>
-                <w14:ligatures w14:val="none"/>
-              </w:rPr>
-              <w:t>DbContext</w:t>
-            </w:r>
-            <w:proofErr w:type="spellEnd"/>
-            <w:r>
-              <w:rPr>
-                <w:rFonts w:ascii="Times New Roman" w:eastAsia="Times New Roman" w:hAnsi="Times New Roman" w:cs="Times New Roman"/>
-                <w:kern w:val="0"/>
-                <w:lang w:eastAsia="en-IN"/>
-                <w14:ligatures w14:val="none"/>
-              </w:rPr>
-              <w:t>• Generic Repository• Entity Repositories• Unit of Work</w:t>
+              <w:t>• DbContext• Generic Repository• Entity Repositories• Unit of Work</w:t>
             </w:r>
           </w:p>
         </w:tc>
@@ -2832,19 +2812,6 @@
         <w:br w:type="page"/>
       </w:r>
     </w:p>
-    <w:p/>
-    <w:p>
-      <w:r>
-        <w:br w:type="page"/>
-      </w:r>
-    </w:p>
-    <w:p/>
-    <w:p>
-      <w:r>
-        <w:br w:type="page"/>
-      </w:r>
-    </w:p>
-    <w:p/>
     <w:sectPr>
       <w:pgSz w:w="11906" w:h="16838"/>
       <w:pgMar w:top="1440" w:right="1440" w:bottom="1440" w:left="1440" w:header="708" w:footer="708" w:gutter="0"/>
@@ -3459,6 +3426,7 @@
   <w:style w:type="character" w:default="1" w:styleId="DefaultParagraphFont">
     <w:name w:val="Default Paragraph Font"/>
     <w:uiPriority w:val="1"/>
+    <w:semiHidden/>
     <w:unhideWhenUsed/>
   </w:style>
   <w:style w:type="table" w:default="1" w:styleId="TableNormal">

</xml_diff>